<commit_message>
Just polishing off the summary.
</commit_message>
<xml_diff>
--- a/Summary.docx
+++ b/Summary.docx
@@ -10,7 +10,6 @@
           <w:rFonts w:ascii="apple-system;system-ui;BlinkMac" w:hAnsi="apple-system;system-ui;BlinkMac"/>
           <w:color w:val="000000"/>
           <w:sz w:val="30"/>
-          <w:lang w:val="en-ZA"/>
         </w:rPr>
       </w:pPr>
       <w:r>
@@ -18,7 +17,6 @@
           <w:rFonts w:ascii="apple-system;system-ui;BlinkMac" w:hAnsi="apple-system;system-ui;BlinkMac"/>
           <w:color w:val="000000"/>
           <w:sz w:val="30"/>
-          <w:lang w:val="en-ZA"/>
         </w:rPr>
         <w:t>When he learns a crucial detail about a left</w:t>
       </w:r>
@@ -27,7 +25,6 @@
           <w:rFonts w:ascii="apple-system;system-ui;BlinkMac" w:hAnsi="apple-system;system-ui;BlinkMac"/>
           <w:color w:val="000000"/>
           <w:sz w:val="30"/>
-          <w:lang w:val="en-ZA"/>
         </w:rPr>
         <w:t>-</w:t>
       </w:r>
@@ -36,7 +33,6 @@
           <w:rFonts w:ascii="apple-system;system-ui;BlinkMac" w:hAnsi="apple-system;system-ui;BlinkMac"/>
           <w:color w:val="000000"/>
           <w:sz w:val="30"/>
-          <w:lang w:val="en-ZA"/>
         </w:rPr>
         <w:t xml:space="preserve">over takeaway, </w:t>
       </w:r>
@@ -45,16 +41,14 @@
           <w:rFonts w:ascii="apple-system;system-ui;BlinkMac" w:hAnsi="apple-system;system-ui;BlinkMac"/>
           <w:color w:val="000000"/>
           <w:sz w:val="30"/>
-          <w:lang w:val="en-ZA"/>
-        </w:rPr>
-        <w:t>disgraced and suspended</w:t>
-      </w:r>
-      <w:r>
-        <w:rPr>
-          <w:rFonts w:ascii="apple-system;system-ui;BlinkMac" w:hAnsi="apple-system;system-ui;BlinkMac"/>
-          <w:color w:val="000000"/>
-          <w:sz w:val="30"/>
-          <w:lang w:val="en-ZA"/>
+        </w:rPr>
+        <w:t>former</w:t>
+      </w:r>
+      <w:r>
+        <w:rPr>
+          <w:rFonts w:ascii="apple-system;system-ui;BlinkMac" w:hAnsi="apple-system;system-ui;BlinkMac"/>
+          <w:color w:val="000000"/>
+          <w:sz w:val="30"/>
         </w:rPr>
         <w:t xml:space="preserve"> </w:t>
       </w:r>
@@ -63,7 +57,6 @@
           <w:rFonts w:ascii="apple-system;system-ui;BlinkMac" w:hAnsi="apple-system;system-ui;BlinkMac"/>
           <w:color w:val="000000"/>
           <w:sz w:val="30"/>
-          <w:lang w:val="en-ZA"/>
         </w:rPr>
         <w:t>D</w:t>
       </w:r>
@@ -72,70 +65,86 @@
           <w:rFonts w:ascii="apple-system;system-ui;BlinkMac" w:hAnsi="apple-system;system-ui;BlinkMac"/>
           <w:color w:val="000000"/>
           <w:sz w:val="30"/>
-          <w:lang w:val="en-ZA"/>
-        </w:rPr>
-        <w:t>etective Inspector Ernesto Klee is certain his former partner was murdered. So now Klee is on the run – from</w:t>
-      </w:r>
-      <w:r>
-        <w:rPr>
-          <w:rFonts w:ascii="apple-system;system-ui;BlinkMac" w:hAnsi="apple-system;system-ui;BlinkMac"/>
-          <w:color w:val="000000"/>
-          <w:sz w:val="30"/>
-          <w:lang w:val="en-ZA"/>
-        </w:rPr>
-        <w:t xml:space="preserve"> his own</w:t>
-      </w:r>
-      <w:r>
-        <w:rPr>
-          <w:rFonts w:ascii="apple-system;system-ui;BlinkMac" w:hAnsi="apple-system;system-ui;BlinkMac"/>
-          <w:color w:val="000000"/>
-          <w:sz w:val="30"/>
-          <w:lang w:val="en-ZA"/>
-        </w:rPr>
-        <w:t xml:space="preserve"> police</w:t>
-      </w:r>
-      <w:r>
-        <w:rPr>
-          <w:rFonts w:ascii="apple-system;system-ui;BlinkMac" w:hAnsi="apple-system;system-ui;BlinkMac"/>
-          <w:color w:val="000000"/>
-          <w:sz w:val="30"/>
-          <w:lang w:val="en-ZA"/>
-        </w:rPr>
-        <w:t xml:space="preserve"> force.</w:t>
-      </w:r>
-      <w:r>
-        <w:rPr>
-          <w:rFonts w:ascii="apple-system;system-ui;BlinkMac" w:hAnsi="apple-system;system-ui;BlinkMac"/>
-          <w:color w:val="000000"/>
-          <w:sz w:val="30"/>
-          <w:lang w:val="en-ZA"/>
-        </w:rPr>
-        <w:t xml:space="preserve"> His idea, with some help from </w:t>
-      </w:r>
-      <w:r>
-        <w:rPr>
-          <w:rFonts w:ascii="apple-system;system-ui;BlinkMac" w:hAnsi="apple-system;system-ui;BlinkMac"/>
-          <w:color w:val="000000"/>
-          <w:sz w:val="30"/>
-          <w:lang w:val="en-ZA"/>
-        </w:rPr>
-        <w:t xml:space="preserve">some of </w:t>
-      </w:r>
-      <w:r>
-        <w:rPr>
-          <w:rFonts w:ascii="apple-system;system-ui;BlinkMac" w:hAnsi="apple-system;system-ui;BlinkMac"/>
-          <w:color w:val="000000"/>
-          <w:sz w:val="30"/>
-          <w:lang w:val="en-ZA"/>
-        </w:rPr>
-        <w:t>the few friends he has left, is to l</w:t>
-      </w:r>
-      <w:r>
-        <w:rPr>
-          <w:rFonts w:ascii="apple-system;system-ui;BlinkMac" w:hAnsi="apple-system;system-ui;BlinkMac"/>
-          <w:color w:val="000000"/>
-          <w:sz w:val="30"/>
-          <w:lang w:val="en-ZA"/>
+        </w:rPr>
+        <w:t xml:space="preserve">etective Inspector Ernesto Klee is certain his </w:t>
+      </w:r>
+      <w:r>
+        <w:rPr>
+          <w:rFonts w:ascii="apple-system;system-ui;BlinkMac" w:hAnsi="apple-system;system-ui;BlinkMac"/>
+          <w:color w:val="000000"/>
+          <w:sz w:val="30"/>
+        </w:rPr>
+        <w:t xml:space="preserve">old </w:t>
+      </w:r>
+      <w:r>
+        <w:rPr>
+          <w:rFonts w:ascii="apple-system;system-ui;BlinkMac" w:hAnsi="apple-system;system-ui;BlinkMac"/>
+          <w:color w:val="000000"/>
+          <w:sz w:val="30"/>
+        </w:rPr>
+        <w:t xml:space="preserve">partner was murdered. </w:t>
+      </w:r>
+      <w:r>
+        <w:rPr>
+          <w:rFonts w:ascii="apple-system;system-ui;BlinkMac" w:hAnsi="apple-system;system-ui;BlinkMac"/>
+          <w:color w:val="000000"/>
+          <w:sz w:val="30"/>
+        </w:rPr>
+        <w:t>N</w:t>
+      </w:r>
+      <w:r>
+        <w:rPr>
+          <w:rFonts w:ascii="apple-system;system-ui;BlinkMac" w:hAnsi="apple-system;system-ui;BlinkMac"/>
+          <w:color w:val="000000"/>
+          <w:sz w:val="30"/>
+        </w:rPr>
+        <w:t>ow Klee is on the run – from</w:t>
+      </w:r>
+      <w:r>
+        <w:rPr>
+          <w:rFonts w:ascii="apple-system;system-ui;BlinkMac" w:hAnsi="apple-system;system-ui;BlinkMac"/>
+          <w:color w:val="000000"/>
+          <w:sz w:val="30"/>
+        </w:rPr>
+        <w:t xml:space="preserve"> the police</w:t>
+      </w:r>
+      <w:r>
+        <w:rPr>
+          <w:rFonts w:ascii="apple-system;system-ui;BlinkMac" w:hAnsi="apple-system;system-ui;BlinkMac"/>
+          <w:color w:val="000000"/>
+          <w:sz w:val="30"/>
+        </w:rPr>
+        <w:t>!</w:t>
+      </w:r>
+      <w:r>
+        <w:rPr>
+          <w:rFonts w:ascii="apple-system;system-ui;BlinkMac" w:hAnsi="apple-system;system-ui;BlinkMac"/>
+          <w:color w:val="000000"/>
+          <w:sz w:val="30"/>
+        </w:rPr>
+        <w:t xml:space="preserve"> His idea, with help from</w:t>
+      </w:r>
+      <w:r>
+        <w:rPr>
+          <w:rFonts w:ascii="apple-system;system-ui;BlinkMac" w:hAnsi="apple-system;system-ui;BlinkMac"/>
+          <w:color w:val="000000"/>
+          <w:sz w:val="30"/>
+        </w:rPr>
+        <w:t xml:space="preserve"> a friend</w:t>
+      </w:r>
+      <w:r>
+        <w:rPr>
+          <w:rFonts w:ascii="apple-system;system-ui;BlinkMac" w:hAnsi="apple-system;system-ui;BlinkMac"/>
+          <w:color w:val="000000"/>
+          <w:sz w:val="30"/>
+        </w:rPr>
+        <w:t>, is to l</w:t>
+      </w:r>
+      <w:r>
+        <w:rPr>
+          <w:rFonts w:ascii="apple-system;system-ui;BlinkMac" w:hAnsi="apple-system;system-ui;BlinkMac"/>
+          <w:color w:val="000000"/>
+          <w:sz w:val="30"/>
         </w:rPr>
         <w:t>ay</w:t>
       </w:r>
@@ -144,9 +153,48 @@
           <w:rFonts w:ascii="apple-system;system-ui;BlinkMac" w:hAnsi="apple-system;system-ui;BlinkMac"/>
           <w:color w:val="000000"/>
           <w:sz w:val="30"/>
-          <w:lang w:val="en-ZA"/>
-        </w:rPr>
-        <w:t xml:space="preserve"> low in another city.</w:t>
+        </w:rPr>
+        <w:t xml:space="preserve"> low in another city</w:t>
+      </w:r>
+      <w:r>
+        <w:rPr>
+          <w:rFonts w:ascii="apple-system;system-ui;BlinkMac" w:hAnsi="apple-system;system-ui;BlinkMac"/>
+          <w:color w:val="000000"/>
+          <w:sz w:val="30"/>
+        </w:rPr>
+        <w:t xml:space="preserve"> -</w:t>
+      </w:r>
+      <w:r>
+        <w:rPr>
+          <w:rFonts w:ascii="apple-system;system-ui;BlinkMac" w:hAnsi="apple-system;system-ui;BlinkMac"/>
+          <w:color w:val="000000"/>
+          <w:sz w:val="30"/>
+        </w:rPr>
+        <w:t xml:space="preserve"> </w:t>
+      </w:r>
+      <w:r>
+        <w:rPr>
+          <w:rFonts w:ascii="apple-system;system-ui;BlinkMac" w:hAnsi="apple-system;system-ui;BlinkMac"/>
+          <w:color w:val="000000"/>
+          <w:sz w:val="30"/>
+        </w:rPr>
+        <w:t xml:space="preserve">take a </w:t>
+      </w:r>
+      <w:r>
+        <w:rPr>
+          <w:rFonts w:ascii="apple-system;system-ui;BlinkMac" w:hAnsi="apple-system;system-ui;BlinkMac"/>
+          <w:color w:val="000000"/>
+          <w:sz w:val="30"/>
+        </w:rPr>
+        <w:t>nice quite job as a live-in security guard.</w:t>
+      </w:r>
+      <w:r>
+        <w:rPr>
+          <w:rFonts w:ascii="apple-system;system-ui;BlinkMac" w:hAnsi="apple-system;system-ui;BlinkMac"/>
+          <w:color w:val="000000"/>
+          <w:sz w:val="30"/>
+        </w:rPr>
+        <w:t xml:space="preserve"> </w:t>
       </w:r>
     </w:p>
     <w:p>
@@ -157,7 +205,6 @@
           <w:rFonts w:ascii="apple-system;system-ui;BlinkMac" w:hAnsi="apple-system;system-ui;BlinkMac"/>
           <w:color w:val="000000"/>
           <w:sz w:val="30"/>
-          <w:lang w:val="en-ZA"/>
         </w:rPr>
       </w:pPr>
     </w:p>
@@ -169,7 +216,6 @@
           <w:rFonts w:ascii="apple-system;system-ui;BlinkMac" w:hAnsi="apple-system;system-ui;BlinkMac"/>
           <w:color w:val="000000"/>
           <w:sz w:val="30"/>
-          <w:lang w:val="en-ZA"/>
         </w:rPr>
       </w:pPr>
       <w:r>
@@ -177,7 +223,14 @@
           <w:rFonts w:ascii="apple-system;system-ui;BlinkMac" w:hAnsi="apple-system;system-ui;BlinkMac"/>
           <w:color w:val="000000"/>
           <w:sz w:val="30"/>
-          <w:lang w:val="en-ZA"/>
+        </w:rPr>
+        <w:t xml:space="preserve">Maybe the whole thing will blow over. </w:t>
+      </w:r>
+      <w:r>
+        <w:rPr>
+          <w:rFonts w:ascii="apple-system;system-ui;BlinkMac" w:hAnsi="apple-system;system-ui;BlinkMac"/>
+          <w:color w:val="000000"/>
+          <w:sz w:val="30"/>
         </w:rPr>
         <w:t xml:space="preserve">Maybe this will be a chance to rest, kick back, take it easy. </w:t>
       </w:r>
@@ -186,36 +239,16 @@
           <w:rFonts w:ascii="apple-system;system-ui;BlinkMac" w:hAnsi="apple-system;system-ui;BlinkMac"/>
           <w:color w:val="000000"/>
           <w:sz w:val="30"/>
-          <w:lang w:val="en-ZA"/>
-        </w:rPr>
-        <w:t>Maybe l</w:t>
-      </w:r>
-      <w:r>
-        <w:rPr>
-          <w:rFonts w:ascii="apple-system;system-ui;BlinkMac" w:hAnsi="apple-system;system-ui;BlinkMac"/>
-          <w:color w:val="000000"/>
-          <w:sz w:val="30"/>
-          <w:lang w:val="en-ZA"/>
-        </w:rPr>
-        <w:t>ay on</w:t>
-      </w:r>
-      <w:r>
-        <w:rPr>
-          <w:rFonts w:ascii="apple-system;system-ui;BlinkMac" w:hAnsi="apple-system;system-ui;BlinkMac"/>
-          <w:color w:val="000000"/>
-          <w:sz w:val="30"/>
-          <w:lang w:val="en-ZA"/>
-        </w:rPr>
-        <w:t xml:space="preserve"> the</w:t>
-      </w:r>
-      <w:r>
-        <w:rPr>
-          <w:rFonts w:ascii="apple-system;system-ui;BlinkMac" w:hAnsi="apple-system;system-ui;BlinkMac"/>
-          <w:color w:val="000000"/>
-          <w:sz w:val="30"/>
-          <w:lang w:val="en-ZA"/>
-        </w:rPr>
-        <w:t xml:space="preserve"> sofa and watch Columbo? Maybe it’s going to be a bit more complicated than that. </w:t>
+        </w:rPr>
+        <w:t xml:space="preserve">It’s a bit </w:t>
+      </w:r>
+      <w:r>
+        <w:rPr>
+          <w:rFonts w:ascii="apple-system;system-ui;BlinkMac" w:hAnsi="apple-system;system-ui;BlinkMac"/>
+          <w:color w:val="000000"/>
+          <w:sz w:val="30"/>
+        </w:rPr>
+        <w:t xml:space="preserve">more complicated than that. </w:t>
       </w:r>
     </w:p>
     <w:p>
@@ -226,7 +259,6 @@
           <w:rFonts w:ascii="apple-system;system-ui;BlinkMac" w:hAnsi="apple-system;system-ui;BlinkMac"/>
           <w:color w:val="000000"/>
           <w:sz w:val="30"/>
-          <w:lang w:val="en-ZA"/>
         </w:rPr>
       </w:pPr>
     </w:p>
@@ -238,7 +270,6 @@
           <w:rFonts w:ascii="apple-system;system-ui;BlinkMac" w:hAnsi="apple-system;system-ui;BlinkMac"/>
           <w:color w:val="000000"/>
           <w:sz w:val="30"/>
-          <w:lang w:val="en-ZA"/>
         </w:rPr>
       </w:pPr>
       <w:r>
@@ -246,7 +277,6 @@
           <w:rFonts w:ascii="apple-system;system-ui;BlinkMac" w:hAnsi="apple-system;system-ui;BlinkMac"/>
           <w:color w:val="000000"/>
           <w:sz w:val="30"/>
-          <w:lang w:val="en-ZA"/>
         </w:rPr>
         <w:t>The</w:t>
       </w:r>
@@ -255,16 +285,30 @@
           <w:rFonts w:ascii="apple-system;system-ui;BlinkMac" w:hAnsi="apple-system;system-ui;BlinkMac"/>
           <w:color w:val="000000"/>
           <w:sz w:val="30"/>
-          <w:lang w:val="en-ZA"/>
-        </w:rPr>
-        <w:t xml:space="preserve"> place Klee is guarding </w:t>
-      </w:r>
-      <w:r>
-        <w:rPr>
-          <w:rFonts w:ascii="apple-system;system-ui;BlinkMac" w:hAnsi="apple-system;system-ui;BlinkMac"/>
-          <w:color w:val="000000"/>
-          <w:sz w:val="30"/>
-          <w:lang w:val="en-ZA"/>
+        </w:rPr>
+        <w:t xml:space="preserve"> </w:t>
+      </w:r>
+      <w:r>
+        <w:rPr>
+          <w:rFonts w:ascii="apple-system;system-ui;BlinkMac" w:hAnsi="apple-system;system-ui;BlinkMac"/>
+          <w:color w:val="000000"/>
+          <w:sz w:val="30"/>
+        </w:rPr>
+        <w:t xml:space="preserve">“house” </w:t>
+      </w:r>
+      <w:r>
+        <w:rPr>
+          <w:rFonts w:ascii="apple-system;system-ui;BlinkMac" w:hAnsi="apple-system;system-ui;BlinkMac"/>
+          <w:color w:val="000000"/>
+          <w:sz w:val="30"/>
+        </w:rPr>
+        <w:t xml:space="preserve">Klee is guarding </w:t>
+      </w:r>
+      <w:r>
+        <w:rPr>
+          <w:rFonts w:ascii="apple-system;system-ui;BlinkMac" w:hAnsi="apple-system;system-ui;BlinkMac"/>
+          <w:color w:val="000000"/>
+          <w:sz w:val="30"/>
         </w:rPr>
         <w:t>is</w:t>
       </w:r>
@@ -273,25 +317,14 @@
           <w:rFonts w:ascii="apple-system;system-ui;BlinkMac" w:hAnsi="apple-system;system-ui;BlinkMac"/>
           <w:color w:val="000000"/>
           <w:sz w:val="30"/>
-          <w:lang w:val="en-ZA"/>
-        </w:rPr>
-        <w:t xml:space="preserve"> enormous. And it’s</w:t>
-      </w:r>
-      <w:r>
-        <w:rPr>
-          <w:rFonts w:ascii="apple-system;system-ui;BlinkMac" w:hAnsi="apple-system;system-ui;BlinkMac"/>
-          <w:color w:val="000000"/>
-          <w:sz w:val="30"/>
-          <w:lang w:val="en-ZA"/>
-        </w:rPr>
-        <w:t xml:space="preserve"> filled with stuff. </w:t>
-      </w:r>
-      <w:r>
-        <w:rPr>
-          <w:rFonts w:ascii="apple-system;system-ui;BlinkMac" w:hAnsi="apple-system;system-ui;BlinkMac"/>
-          <w:color w:val="000000"/>
-          <w:sz w:val="30"/>
-          <w:lang w:val="en-ZA"/>
+        </w:rPr>
+        <w:t xml:space="preserve"> enormous. </w:t>
+      </w:r>
+      <w:r>
+        <w:rPr>
+          <w:rFonts w:ascii="apple-system;system-ui;BlinkMac" w:hAnsi="apple-system;system-ui;BlinkMac"/>
+          <w:color w:val="000000"/>
+          <w:sz w:val="30"/>
         </w:rPr>
         <w:t xml:space="preserve">It’s hard to say if it’s a </w:t>
       </w:r>
@@ -300,7 +333,6 @@
           <w:rFonts w:ascii="apple-system;system-ui;BlinkMac" w:hAnsi="apple-system;system-ui;BlinkMac"/>
           <w:color w:val="000000"/>
           <w:sz w:val="30"/>
-          <w:lang w:val="en-ZA"/>
         </w:rPr>
         <w:t>treasure house</w:t>
       </w:r>
@@ -309,7 +341,6 @@
           <w:rFonts w:ascii="apple-system;system-ui;BlinkMac" w:hAnsi="apple-system;system-ui;BlinkMac"/>
           <w:color w:val="000000"/>
           <w:sz w:val="30"/>
-          <w:lang w:val="en-ZA"/>
         </w:rPr>
         <w:t xml:space="preserve"> or</w:t>
       </w:r>
@@ -318,7 +349,6 @@
           <w:rFonts w:ascii="apple-system;system-ui;BlinkMac" w:hAnsi="apple-system;system-ui;BlinkMac"/>
           <w:color w:val="000000"/>
           <w:sz w:val="30"/>
-          <w:lang w:val="en-ZA"/>
         </w:rPr>
         <w:t xml:space="preserve"> a rubbish </w:t>
       </w:r>
@@ -327,7 +357,6 @@
           <w:rFonts w:ascii="apple-system;system-ui;BlinkMac" w:hAnsi="apple-system;system-ui;BlinkMac"/>
           <w:color w:val="000000"/>
           <w:sz w:val="30"/>
-          <w:lang w:val="en-ZA"/>
         </w:rPr>
         <w:t>dump</w:t>
       </w:r>
@@ -336,7 +365,6 @@
           <w:rFonts w:ascii="apple-system;system-ui;BlinkMac" w:hAnsi="apple-system;system-ui;BlinkMac"/>
           <w:color w:val="000000"/>
           <w:sz w:val="30"/>
-          <w:lang w:val="en-ZA"/>
         </w:rPr>
         <w:t>.</w:t>
       </w:r>
@@ -345,7 +373,6 @@
           <w:rFonts w:ascii="apple-system;system-ui;BlinkMac" w:hAnsi="apple-system;system-ui;BlinkMac"/>
           <w:color w:val="000000"/>
           <w:sz w:val="30"/>
-          <w:lang w:val="en-ZA"/>
         </w:rPr>
         <w:t xml:space="preserve"> </w:t>
       </w:r>
@@ -354,43 +381,46 @@
           <w:rFonts w:ascii="apple-system;system-ui;BlinkMac" w:hAnsi="apple-system;system-ui;BlinkMac"/>
           <w:color w:val="000000"/>
           <w:sz w:val="30"/>
-          <w:lang w:val="en-ZA"/>
-        </w:rPr>
-        <w:t>And w</w:t>
-      </w:r>
-      <w:r>
-        <w:rPr>
-          <w:rFonts w:ascii="apple-system;system-ui;BlinkMac" w:hAnsi="apple-system;system-ui;BlinkMac"/>
-          <w:color w:val="000000"/>
-          <w:sz w:val="30"/>
-          <w:lang w:val="en-ZA"/>
-        </w:rPr>
-        <w:t xml:space="preserve">hy </w:t>
-      </w:r>
-      <w:r>
-        <w:rPr>
-          <w:rFonts w:ascii="apple-system;system-ui;BlinkMac" w:hAnsi="apple-system;system-ui;BlinkMac"/>
-          <w:color w:val="000000"/>
-          <w:sz w:val="30"/>
-          <w:lang w:val="en-ZA"/>
-        </w:rPr>
-        <w:t xml:space="preserve">is </w:t>
-      </w:r>
-      <w:r>
-        <w:rPr>
-          <w:rFonts w:ascii="apple-system;system-ui;BlinkMac" w:hAnsi="apple-system;system-ui;BlinkMac"/>
-          <w:color w:val="000000"/>
-          <w:sz w:val="30"/>
-          <w:lang w:val="en-ZA"/>
-        </w:rPr>
-        <w:t>there a Bedouin tent in the middle of it?</w:t>
-      </w:r>
-      <w:r>
-        <w:rPr>
-          <w:rFonts w:ascii="apple-system;system-ui;BlinkMac" w:hAnsi="apple-system;system-ui;BlinkMac"/>
-          <w:color w:val="000000"/>
-          <w:sz w:val="30"/>
-          <w:lang w:val="en-ZA"/>
+        </w:rPr>
+        <w:t>T</w:t>
+      </w:r>
+      <w:r>
+        <w:rPr>
+          <w:rFonts w:ascii="apple-system;system-ui;BlinkMac" w:hAnsi="apple-system;system-ui;BlinkMac"/>
+          <w:color w:val="000000"/>
+          <w:sz w:val="30"/>
+        </w:rPr>
+        <w:t>here</w:t>
+      </w:r>
+      <w:r>
+        <w:rPr>
+          <w:rFonts w:ascii="apple-system;system-ui;BlinkMac" w:hAnsi="apple-system;system-ui;BlinkMac"/>
+          <w:color w:val="000000"/>
+          <w:sz w:val="30"/>
+        </w:rPr>
+        <w:t>’s</w:t>
+      </w:r>
+      <w:r>
+        <w:rPr>
+          <w:rFonts w:ascii="apple-system;system-ui;BlinkMac" w:hAnsi="apple-system;system-ui;BlinkMac"/>
+          <w:color w:val="000000"/>
+          <w:sz w:val="30"/>
+        </w:rPr>
+        <w:t xml:space="preserve"> a Bedouin tent in the middle of it</w:t>
+      </w:r>
+      <w:r>
+        <w:rPr>
+          <w:rFonts w:ascii="apple-system;system-ui;BlinkMac" w:hAnsi="apple-system;system-ui;BlinkMac"/>
+          <w:color w:val="000000"/>
+          <w:sz w:val="30"/>
+        </w:rPr>
+        <w:t>.</w:t>
+      </w:r>
+      <w:r>
+        <w:rPr>
+          <w:rFonts w:ascii="apple-system;system-ui;BlinkMac" w:hAnsi="apple-system;system-ui;BlinkMac"/>
+          <w:color w:val="000000"/>
+          <w:sz w:val="30"/>
         </w:rPr>
         <w:t xml:space="preserve"> </w:t>
       </w:r>
@@ -399,36 +429,62 @@
           <w:rFonts w:ascii="apple-system;system-ui;BlinkMac" w:hAnsi="apple-system;system-ui;BlinkMac"/>
           <w:color w:val="000000"/>
           <w:sz w:val="30"/>
-          <w:lang w:val="en-ZA"/>
-        </w:rPr>
-        <w:t xml:space="preserve">And a is that a maze in the back room? </w:t>
-      </w:r>
-      <w:proofErr w:type="gramStart"/>
-      <w:r>
-        <w:rPr>
-          <w:rFonts w:ascii="apple-system;system-ui;BlinkMac" w:hAnsi="apple-system;system-ui;BlinkMac"/>
-          <w:color w:val="000000"/>
-          <w:sz w:val="30"/>
-          <w:lang w:val="en-ZA"/>
-        </w:rPr>
-        <w:t>Klee</w:t>
-      </w:r>
-      <w:proofErr w:type="gramEnd"/>
-      <w:r>
-        <w:rPr>
-          <w:rFonts w:ascii="apple-system;system-ui;BlinkMac" w:hAnsi="apple-system;system-ui;BlinkMac"/>
-          <w:color w:val="000000"/>
-          <w:sz w:val="30"/>
-          <w:lang w:val="en-ZA"/>
-        </w:rPr>
-        <w:t xml:space="preserve"> is</w:t>
-      </w:r>
-      <w:r>
-        <w:rPr>
-          <w:rFonts w:ascii="apple-system;system-ui;BlinkMac" w:hAnsi="apple-system;system-ui;BlinkMac"/>
-          <w:color w:val="000000"/>
-          <w:sz w:val="30"/>
-          <w:lang w:val="en-ZA"/>
+        </w:rPr>
+        <w:t>And oh yes</w:t>
+      </w:r>
+      <w:r>
+        <w:rPr>
+          <w:rFonts w:ascii="apple-system;system-ui;BlinkMac" w:hAnsi="apple-system;system-ui;BlinkMac"/>
+          <w:color w:val="000000"/>
+          <w:sz w:val="30"/>
+        </w:rPr>
+        <w:t xml:space="preserve"> - a</w:t>
+      </w:r>
+      <w:r>
+        <w:rPr>
+          <w:rFonts w:ascii="apple-system;system-ui;BlinkMac" w:hAnsi="apple-system;system-ui;BlinkMac"/>
+          <w:color w:val="000000"/>
+          <w:sz w:val="30"/>
+        </w:rPr>
+        <w:t xml:space="preserve"> maze </w:t>
+      </w:r>
+      <w:r>
+        <w:rPr>
+          <w:rFonts w:ascii="apple-system;system-ui;BlinkMac" w:hAnsi="apple-system;system-ui;BlinkMac"/>
+          <w:color w:val="000000"/>
+          <w:sz w:val="30"/>
+        </w:rPr>
+        <w:t>in the back room</w:t>
+      </w:r>
+      <w:r>
+        <w:rPr>
+          <w:rFonts w:ascii="apple-system;system-ui;BlinkMac" w:hAnsi="apple-system;system-ui;BlinkMac"/>
+          <w:color w:val="000000"/>
+          <w:sz w:val="30"/>
+        </w:rPr>
+        <w:t>.</w:t>
+      </w:r>
+      <w:r>
+        <w:rPr>
+          <w:rFonts w:ascii="apple-system;system-ui;BlinkMac" w:hAnsi="apple-system;system-ui;BlinkMac"/>
+          <w:color w:val="000000"/>
+          <w:sz w:val="30"/>
+        </w:rPr>
+        <w:t xml:space="preserve"> </w:t>
+      </w:r>
+      <w:r>
+        <w:rPr>
+          <w:rFonts w:ascii="apple-system;system-ui;BlinkMac" w:hAnsi="apple-system;system-ui;BlinkMac"/>
+          <w:color w:val="000000"/>
+          <w:sz w:val="30"/>
+        </w:rPr>
+        <w:t>Klee is</w:t>
+      </w:r>
+      <w:r>
+        <w:rPr>
+          <w:rFonts w:ascii="apple-system;system-ui;BlinkMac" w:hAnsi="apple-system;system-ui;BlinkMac"/>
+          <w:color w:val="000000"/>
+          <w:sz w:val="30"/>
         </w:rPr>
         <w:t xml:space="preserve"> trying to make sense of</w:t>
       </w:r>
@@ -437,43 +493,46 @@
           <w:rFonts w:ascii="apple-system;system-ui;BlinkMac" w:hAnsi="apple-system;system-ui;BlinkMac"/>
           <w:color w:val="000000"/>
           <w:sz w:val="30"/>
-          <w:lang w:val="en-ZA"/>
-        </w:rPr>
-        <w:t xml:space="preserve"> an</w:t>
-      </w:r>
-      <w:r>
-        <w:rPr>
-          <w:rFonts w:ascii="apple-system;system-ui;BlinkMac" w:hAnsi="apple-system;system-ui;BlinkMac"/>
-          <w:color w:val="000000"/>
-          <w:sz w:val="30"/>
-          <w:lang w:val="en-ZA"/>
-        </w:rPr>
-        <w:t xml:space="preserve"> actual labyrinth when he interrupts</w:t>
-      </w:r>
-      <w:r>
-        <w:rPr>
-          <w:rFonts w:ascii="apple-system;system-ui;BlinkMac" w:hAnsi="apple-system;system-ui;BlinkMac"/>
-          <w:color w:val="000000"/>
-          <w:sz w:val="30"/>
-          <w:lang w:val="en-ZA"/>
-        </w:rPr>
-        <w:t xml:space="preserve"> what appear to be</w:t>
-      </w:r>
-      <w:r>
-        <w:rPr>
-          <w:rFonts w:ascii="apple-system;system-ui;BlinkMac" w:hAnsi="apple-system;system-ui;BlinkMac"/>
-          <w:color w:val="000000"/>
-          <w:sz w:val="30"/>
-          <w:lang w:val="en-ZA"/>
-        </w:rPr>
-        <w:t xml:space="preserve"> burglars</w:t>
-      </w:r>
-      <w:r>
-        <w:rPr>
-          <w:rFonts w:ascii="apple-system;system-ui;BlinkMac" w:hAnsi="apple-system;system-ui;BlinkMac"/>
-          <w:color w:val="000000"/>
-          <w:sz w:val="30"/>
-          <w:lang w:val="en-ZA"/>
+        </w:rPr>
+        <w:t xml:space="preserve"> </w:t>
+      </w:r>
+      <w:r>
+        <w:rPr>
+          <w:rFonts w:ascii="apple-system;system-ui;BlinkMac" w:hAnsi="apple-system;system-ui;BlinkMac"/>
+          <w:color w:val="000000"/>
+          <w:sz w:val="30"/>
+        </w:rPr>
+        <w:t xml:space="preserve">this actual </w:t>
+      </w:r>
+      <w:r>
+        <w:rPr>
+          <w:rFonts w:ascii="apple-system;system-ui;BlinkMac" w:hAnsi="apple-system;system-ui;BlinkMac"/>
+          <w:color w:val="000000"/>
+          <w:sz w:val="30"/>
+        </w:rPr>
+        <w:t>labyrinth when he interrupts</w:t>
+      </w:r>
+      <w:r>
+        <w:rPr>
+          <w:rFonts w:ascii="apple-system;system-ui;BlinkMac" w:hAnsi="apple-system;system-ui;BlinkMac"/>
+          <w:color w:val="000000"/>
+          <w:sz w:val="30"/>
+        </w:rPr>
+        <w:t xml:space="preserve"> </w:t>
+      </w:r>
+      <w:r>
+        <w:rPr>
+          <w:rFonts w:ascii="apple-system;system-ui;BlinkMac" w:hAnsi="apple-system;system-ui;BlinkMac"/>
+          <w:color w:val="000000"/>
+          <w:sz w:val="30"/>
+        </w:rPr>
+        <w:t>burglars</w:t>
+      </w:r>
+      <w:r>
+        <w:rPr>
+          <w:rFonts w:ascii="apple-system;system-ui;BlinkMac" w:hAnsi="apple-system;system-ui;BlinkMac"/>
+          <w:color w:val="000000"/>
+          <w:sz w:val="30"/>
         </w:rPr>
         <w:t>.</w:t>
       </w:r>
@@ -482,25 +541,86 @@
           <w:rFonts w:ascii="apple-system;system-ui;BlinkMac" w:hAnsi="apple-system;system-ui;BlinkMac"/>
           <w:color w:val="000000"/>
           <w:sz w:val="30"/>
-          <w:lang w:val="en-ZA"/>
-        </w:rPr>
-        <w:t xml:space="preserve"> But did they steal something, or leave something behind? </w:t>
-      </w:r>
-      <w:r>
-        <w:rPr>
-          <w:rFonts w:ascii="apple-system;system-ui;BlinkMac" w:hAnsi="apple-system;system-ui;BlinkMac"/>
-          <w:color w:val="000000"/>
-          <w:sz w:val="30"/>
-          <w:lang w:val="en-ZA"/>
-        </w:rPr>
-        <w:t>Was this t</w:t>
-      </w:r>
-      <w:r>
-        <w:rPr>
-          <w:rFonts w:ascii="apple-system;system-ui;BlinkMac" w:hAnsi="apple-system;system-ui;BlinkMac"/>
-          <w:color w:val="000000"/>
-          <w:sz w:val="30"/>
-          <w:lang w:val="en-ZA"/>
+        </w:rPr>
+        <w:t xml:space="preserve"> </w:t>
+      </w:r>
+      <w:r>
+        <w:rPr>
+          <w:rFonts w:ascii="apple-system;system-ui;BlinkMac" w:hAnsi="apple-system;system-ui;BlinkMac"/>
+          <w:color w:val="000000"/>
+          <w:sz w:val="30"/>
+        </w:rPr>
+        <w:t>But is that what they</w:t>
+      </w:r>
+      <w:r>
+        <w:rPr>
+          <w:rFonts w:ascii="apple-system;system-ui;BlinkMac" w:hAnsi="apple-system;system-ui;BlinkMac"/>
+          <w:color w:val="000000"/>
+          <w:sz w:val="30"/>
+        </w:rPr>
+        <w:t xml:space="preserve"> are</w:t>
+      </w:r>
+      <w:r>
+        <w:rPr>
+          <w:rFonts w:ascii="apple-system;system-ui;BlinkMac" w:hAnsi="apple-system;system-ui;BlinkMac"/>
+          <w:color w:val="000000"/>
+          <w:sz w:val="30"/>
+        </w:rPr>
+        <w:t>? D</w:t>
+      </w:r>
+      <w:r>
+        <w:rPr>
+          <w:rFonts w:ascii="apple-system;system-ui;BlinkMac" w:hAnsi="apple-system;system-ui;BlinkMac"/>
+          <w:color w:val="000000"/>
+          <w:sz w:val="30"/>
+        </w:rPr>
+        <w:t>id they steal something, or</w:t>
+      </w:r>
+      <w:r>
+        <w:rPr>
+          <w:rFonts w:ascii="apple-system;system-ui;BlinkMac" w:hAnsi="apple-system;system-ui;BlinkMac"/>
+          <w:color w:val="000000"/>
+          <w:sz w:val="30"/>
+        </w:rPr>
+        <w:t xml:space="preserve"> did they</w:t>
+      </w:r>
+      <w:r>
+        <w:rPr>
+          <w:rFonts w:ascii="apple-system;system-ui;BlinkMac" w:hAnsi="apple-system;system-ui;BlinkMac"/>
+          <w:color w:val="000000"/>
+          <w:sz w:val="30"/>
+        </w:rPr>
+        <w:t xml:space="preserve"> leave something behind? </w:t>
+      </w:r>
+      <w:r>
+        <w:rPr>
+          <w:rFonts w:ascii="apple-system;system-ui;BlinkMac" w:hAnsi="apple-system;system-ui;BlinkMac"/>
+          <w:color w:val="000000"/>
+          <w:sz w:val="30"/>
+        </w:rPr>
+        <w:t xml:space="preserve">Was </w:t>
+      </w:r>
+      <w:r>
+        <w:rPr>
+          <w:rFonts w:ascii="apple-system;system-ui;BlinkMac" w:hAnsi="apple-system;system-ui;BlinkMac"/>
+          <w:color w:val="000000"/>
+          <w:sz w:val="30"/>
+        </w:rPr>
+        <w:t>it</w:t>
+      </w:r>
+      <w:r>
+        <w:rPr>
+          <w:rFonts w:ascii="apple-system;system-ui;BlinkMac" w:hAnsi="apple-system;system-ui;BlinkMac"/>
+          <w:color w:val="000000"/>
+          <w:sz w:val="30"/>
+        </w:rPr>
+        <w:t xml:space="preserve"> t</w:t>
+      </w:r>
+      <w:r>
+        <w:rPr>
+          <w:rFonts w:ascii="apple-system;system-ui;BlinkMac" w:hAnsi="apple-system;system-ui;BlinkMac"/>
+          <w:color w:val="000000"/>
+          <w:sz w:val="30"/>
         </w:rPr>
         <w:t>heft? Or</w:t>
       </w:r>
@@ -509,7 +629,6 @@
           <w:rFonts w:ascii="apple-system;system-ui;BlinkMac" w:hAnsi="apple-system;system-ui;BlinkMac"/>
           <w:color w:val="000000"/>
           <w:sz w:val="30"/>
-          <w:lang w:val="en-ZA"/>
         </w:rPr>
         <w:t xml:space="preserve"> </w:t>
       </w:r>
@@ -518,18 +637,8 @@
           <w:rFonts w:ascii="apple-system;system-ui;BlinkMac" w:hAnsi="apple-system;system-ui;BlinkMac"/>
           <w:color w:val="000000"/>
           <w:sz w:val="30"/>
-          <w:lang w:val="en-ZA"/>
-        </w:rPr>
-        <w:t>a</w:t>
-      </w:r>
-      <w:r>
-        <w:rPr>
-          <w:rFonts w:ascii="apple-system;system-ui;BlinkMac" w:hAnsi="apple-system;system-ui;BlinkMac"/>
-          <w:color w:val="000000"/>
-          <w:sz w:val="30"/>
-          <w:lang w:val="en-ZA"/>
-        </w:rPr>
-        <w:t xml:space="preserve"> particularly aggressive kind of fly-tipping?</w:t>
+        </w:rPr>
+        <w:t>aggressive fly-tipping?</w:t>
       </w:r>
     </w:p>
     <w:p>
@@ -540,7 +649,6 @@
           <w:rFonts w:ascii="apple-system;system-ui;BlinkMac" w:hAnsi="apple-system;system-ui;BlinkMac"/>
           <w:color w:val="000000"/>
           <w:sz w:val="30"/>
-          <w:lang w:val="en-ZA"/>
         </w:rPr>
       </w:pPr>
     </w:p>
@@ -552,7 +660,6 @@
           <w:rFonts w:ascii="apple-system;system-ui;BlinkMac" w:hAnsi="apple-system;system-ui;BlinkMac"/>
           <w:color w:val="000000"/>
           <w:sz w:val="30"/>
-          <w:lang w:val="en-ZA"/>
         </w:rPr>
       </w:pPr>
       <w:r>
@@ -560,65 +667,137 @@
           <w:rFonts w:ascii="apple-system;system-ui;BlinkMac" w:hAnsi="apple-system;system-ui;BlinkMac"/>
           <w:color w:val="000000"/>
           <w:sz w:val="30"/>
-          <w:lang w:val="en-ZA"/>
-        </w:rPr>
-        <w:t xml:space="preserve">What the hell is going on?  Not always, or ever </w:t>
-      </w:r>
-      <w:proofErr w:type="gramStart"/>
-      <w:r>
-        <w:rPr>
-          <w:rFonts w:ascii="apple-system;system-ui;BlinkMac" w:hAnsi="apple-system;system-ui;BlinkMac"/>
-          <w:color w:val="000000"/>
-          <w:sz w:val="30"/>
-          <w:lang w:val="en-ZA"/>
-        </w:rPr>
-        <w:t>the</w:t>
-      </w:r>
-      <w:r>
-        <w:rPr>
-          <w:rFonts w:ascii="apple-system;system-ui;BlinkMac" w:hAnsi="apple-system;system-ui;BlinkMac"/>
-          <w:color w:val="000000"/>
-          <w:sz w:val="30"/>
-          <w:lang w:val="en-ZA"/>
+        </w:rPr>
+        <w:t xml:space="preserve">Rarely, if ever, </w:t>
+      </w:r>
+      <w:r>
+        <w:rPr>
+          <w:rFonts w:ascii="apple-system;system-ui;BlinkMac" w:hAnsi="apple-system;system-ui;BlinkMac"/>
+          <w:color w:val="000000"/>
+          <w:sz w:val="30"/>
+        </w:rPr>
+        <w:t>optimistic</w:t>
+      </w:r>
+      <w:r>
+        <w:rPr>
+          <w:rFonts w:ascii="apple-system;system-ui;BlinkMac" w:hAnsi="apple-system;system-ui;BlinkMac"/>
+          <w:color w:val="000000"/>
+          <w:sz w:val="30"/>
         </w:rPr>
         <w:t>,</w:t>
       </w:r>
-      <w:proofErr w:type="gramEnd"/>
-      <w:r>
-        <w:rPr>
-          <w:rFonts w:ascii="apple-system;system-ui;BlinkMac" w:hAnsi="apple-system;system-ui;BlinkMac"/>
-          <w:color w:val="000000"/>
-          <w:sz w:val="30"/>
-          <w:lang w:val="en-ZA"/>
-        </w:rPr>
-        <w:t xml:space="preserve"> optimist,</w:t>
-      </w:r>
-      <w:r>
-        <w:rPr>
-          <w:rFonts w:ascii="apple-system;system-ui;BlinkMac" w:hAnsi="apple-system;system-ui;BlinkMac"/>
-          <w:color w:val="000000"/>
-          <w:sz w:val="30"/>
-          <w:lang w:val="en-ZA"/>
-        </w:rPr>
-        <w:t xml:space="preserve"> Klee starts to have an inkling. Of course, it’s no coincidence that his friend has sent him on this job. But he</w:t>
-      </w:r>
-      <w:r>
-        <w:rPr>
-          <w:rFonts w:ascii="apple-system;system-ui;BlinkMac" w:hAnsi="apple-system;system-ui;BlinkMac"/>
-          <w:color w:val="000000"/>
-          <w:sz w:val="30"/>
-          <w:lang w:val="en-ZA"/>
-        </w:rPr>
-        <w:t xml:space="preserve"> can’t quite believe</w:t>
-      </w:r>
-      <w:r>
-        <w:rPr>
-          <w:rFonts w:ascii="apple-system;system-ui;BlinkMac" w:hAnsi="apple-system;system-ui;BlinkMac"/>
-          <w:color w:val="000000"/>
-          <w:sz w:val="30"/>
-          <w:lang w:val="en-ZA"/>
-        </w:rPr>
-        <w:t xml:space="preserve"> what he’s starting to suspect. Maybe, finally, this could be his lucky day.</w:t>
+      <w:r>
+        <w:rPr>
+          <w:rFonts w:ascii="apple-system;system-ui;BlinkMac" w:hAnsi="apple-system;system-ui;BlinkMac"/>
+          <w:color w:val="000000"/>
+          <w:sz w:val="30"/>
+        </w:rPr>
+        <w:t xml:space="preserve"> Klee starts to </w:t>
+      </w:r>
+      <w:r>
+        <w:rPr>
+          <w:rFonts w:ascii="apple-system;system-ui;BlinkMac" w:hAnsi="apple-system;system-ui;BlinkMac"/>
+          <w:color w:val="000000"/>
+          <w:sz w:val="30"/>
+        </w:rPr>
+        <w:t xml:space="preserve">see </w:t>
+      </w:r>
+      <w:r>
+        <w:rPr>
+          <w:rFonts w:ascii="apple-system;system-ui;BlinkMac" w:hAnsi="apple-system;system-ui;BlinkMac"/>
+          <w:color w:val="000000"/>
+          <w:sz w:val="30"/>
+        </w:rPr>
+        <w:t>the tiniest glimmer of hope</w:t>
+      </w:r>
+      <w:r>
+        <w:rPr>
+          <w:rFonts w:ascii="apple-system;system-ui;BlinkMac" w:hAnsi="apple-system;system-ui;BlinkMac"/>
+          <w:color w:val="000000"/>
+          <w:sz w:val="30"/>
+        </w:rPr>
+        <w:t xml:space="preserve">. </w:t>
+      </w:r>
+      <w:r>
+        <w:rPr>
+          <w:rFonts w:ascii="apple-system;system-ui;BlinkMac" w:hAnsi="apple-system;system-ui;BlinkMac"/>
+          <w:color w:val="000000"/>
+          <w:sz w:val="30"/>
+        </w:rPr>
+        <w:t xml:space="preserve">A love of anagrams leads him to notice something strange about his landlord’s name. </w:t>
+      </w:r>
+      <w:r>
+        <w:rPr>
+          <w:rFonts w:ascii="apple-system;system-ui;BlinkMac" w:hAnsi="apple-system;system-ui;BlinkMac"/>
+          <w:color w:val="000000"/>
+          <w:sz w:val="30"/>
+        </w:rPr>
+        <w:t>Of course</w:t>
+      </w:r>
+      <w:r>
+        <w:rPr>
+          <w:rFonts w:ascii="apple-system;system-ui;BlinkMac" w:hAnsi="apple-system;system-ui;BlinkMac"/>
+          <w:color w:val="000000"/>
+          <w:sz w:val="30"/>
+        </w:rPr>
+        <w:t>!</w:t>
+      </w:r>
+      <w:r>
+        <w:rPr>
+          <w:rFonts w:ascii="apple-system;system-ui;BlinkMac" w:hAnsi="apple-system;system-ui;BlinkMac"/>
+          <w:color w:val="000000"/>
+          <w:sz w:val="30"/>
+        </w:rPr>
+        <w:t xml:space="preserve"> </w:t>
+      </w:r>
+      <w:r>
+        <w:rPr>
+          <w:rFonts w:ascii="apple-system;system-ui;BlinkMac" w:hAnsi="apple-system;system-ui;BlinkMac"/>
+          <w:color w:val="000000"/>
+          <w:sz w:val="30"/>
+        </w:rPr>
+        <w:t>I</w:t>
+      </w:r>
+      <w:r>
+        <w:rPr>
+          <w:rFonts w:ascii="apple-system;system-ui;BlinkMac" w:hAnsi="apple-system;system-ui;BlinkMac"/>
+          <w:color w:val="000000"/>
+          <w:sz w:val="30"/>
+        </w:rPr>
+        <w:t xml:space="preserve">t’s no coincidence his friend sent him on this job. </w:t>
+      </w:r>
+      <w:r>
+        <w:rPr>
+          <w:rFonts w:ascii="apple-system;system-ui;BlinkMac" w:hAnsi="apple-system;system-ui;BlinkMac"/>
+          <w:color w:val="000000"/>
+          <w:sz w:val="30"/>
+        </w:rPr>
+        <w:br/>
+        <w:t>C</w:t>
+      </w:r>
+      <w:r>
+        <w:rPr>
+          <w:rFonts w:ascii="apple-system;system-ui;BlinkMac" w:hAnsi="apple-system;system-ui;BlinkMac"/>
+          <w:color w:val="000000"/>
+          <w:sz w:val="30"/>
+        </w:rPr>
+        <w:t xml:space="preserve">ould this really be what he thinks it is? Could this </w:t>
+      </w:r>
+      <w:r>
+        <w:rPr>
+          <w:rFonts w:ascii="apple-system;system-ui;BlinkMac" w:hAnsi="apple-system;system-ui;BlinkMac"/>
+          <w:color w:val="000000"/>
+          <w:sz w:val="30"/>
+        </w:rPr>
+        <w:t>finally be his lucky day</w:t>
+      </w:r>
+      <w:r>
+        <w:rPr>
+          <w:rFonts w:ascii="apple-system;system-ui;BlinkMac" w:hAnsi="apple-system;system-ui;BlinkMac"/>
+          <w:color w:val="000000"/>
+          <w:sz w:val="30"/>
+        </w:rPr>
+        <w:t>?</w:t>
       </w:r>
     </w:p>
     <w:p>
@@ -629,7 +808,6 @@
           <w:rFonts w:ascii="apple-system;system-ui;BlinkMac" w:hAnsi="apple-system;system-ui;BlinkMac"/>
           <w:color w:val="000000"/>
           <w:sz w:val="30"/>
-          <w:lang w:val="en-ZA"/>
         </w:rPr>
       </w:pPr>
     </w:p>
@@ -641,7 +819,6 @@
           <w:rFonts w:ascii="apple-system;system-ui;BlinkMac" w:hAnsi="apple-system;system-ui;BlinkMac"/>
           <w:color w:val="000000"/>
           <w:sz w:val="30"/>
-          <w:lang w:val="en-ZA"/>
         </w:rPr>
       </w:pPr>
       <w:r>
@@ -649,16 +826,14 @@
           <w:rFonts w:ascii="apple-system;system-ui;BlinkMac" w:hAnsi="apple-system;system-ui;BlinkMac"/>
           <w:color w:val="000000"/>
           <w:sz w:val="30"/>
-          <w:lang w:val="en-ZA"/>
-        </w:rPr>
-        <w:t xml:space="preserve">OK, </w:t>
-      </w:r>
-      <w:r>
-        <w:rPr>
-          <w:rFonts w:ascii="apple-system;system-ui;BlinkMac" w:hAnsi="apple-system;system-ui;BlinkMac"/>
-          <w:color w:val="000000"/>
-          <w:sz w:val="30"/>
-          <w:lang w:val="en-ZA"/>
+        </w:rPr>
+        <w:t xml:space="preserve">Yes, </w:t>
+      </w:r>
+      <w:r>
+        <w:rPr>
+          <w:rFonts w:ascii="apple-system;system-ui;BlinkMac" w:hAnsi="apple-system;system-ui;BlinkMac"/>
+          <w:color w:val="000000"/>
+          <w:sz w:val="30"/>
         </w:rPr>
         <w:t xml:space="preserve">he’s </w:t>
       </w:r>
@@ -667,25 +842,38 @@
           <w:rFonts w:ascii="apple-system;system-ui;BlinkMac" w:hAnsi="apple-system;system-ui;BlinkMac"/>
           <w:color w:val="000000"/>
           <w:sz w:val="30"/>
-          <w:lang w:val="en-ZA"/>
-        </w:rPr>
-        <w:t xml:space="preserve">on the run from the police </w:t>
-      </w:r>
-      <w:r>
-        <w:rPr>
-          <w:rFonts w:ascii="apple-system;system-ui;BlinkMac" w:hAnsi="apple-system;system-ui;BlinkMac"/>
-          <w:color w:val="000000"/>
-          <w:sz w:val="30"/>
-          <w:lang w:val="en-ZA"/>
-        </w:rPr>
-        <w:t xml:space="preserve">because he dared to try to </w:t>
-      </w:r>
-      <w:r>
-        <w:rPr>
-          <w:rFonts w:ascii="apple-system;system-ui;BlinkMac" w:hAnsi="apple-system;system-ui;BlinkMac"/>
-          <w:color w:val="000000"/>
-          <w:sz w:val="30"/>
-          <w:lang w:val="en-ZA"/>
+        </w:rPr>
+        <w:t xml:space="preserve">on the run </w:t>
+      </w:r>
+      <w:r>
+        <w:rPr>
+          <w:rFonts w:ascii="apple-system;system-ui;BlinkMac" w:hAnsi="apple-system;system-ui;BlinkMac"/>
+          <w:color w:val="000000"/>
+          <w:sz w:val="30"/>
+        </w:rPr>
+        <w:t xml:space="preserve">because he </w:t>
+      </w:r>
+      <w:r>
+        <w:rPr>
+          <w:rFonts w:ascii="apple-system;system-ui;BlinkMac" w:hAnsi="apple-system;system-ui;BlinkMac"/>
+          <w:color w:val="000000"/>
+          <w:sz w:val="30"/>
+        </w:rPr>
+        <w:t xml:space="preserve">tried </w:t>
+      </w:r>
+      <w:r>
+        <w:rPr>
+          <w:rFonts w:ascii="apple-system;system-ui;BlinkMac" w:hAnsi="apple-system;system-ui;BlinkMac"/>
+          <w:color w:val="000000"/>
+          <w:sz w:val="30"/>
+        </w:rPr>
+        <w:t xml:space="preserve">to </w:t>
+      </w:r>
+      <w:r>
+        <w:rPr>
+          <w:rFonts w:ascii="apple-system;system-ui;BlinkMac" w:hAnsi="apple-system;system-ui;BlinkMac"/>
+          <w:color w:val="000000"/>
+          <w:sz w:val="30"/>
         </w:rPr>
         <w:t xml:space="preserve">solve the most investigated murder in British </w:t>
       </w:r>
@@ -694,7 +882,6 @@
           <w:rFonts w:ascii="apple-system;system-ui;BlinkMac" w:hAnsi="apple-system;system-ui;BlinkMac"/>
           <w:color w:val="000000"/>
           <w:sz w:val="30"/>
-          <w:lang w:val="en-ZA"/>
         </w:rPr>
         <w:t>c</w:t>
       </w:r>
@@ -703,7 +890,6 @@
           <w:rFonts w:ascii="apple-system;system-ui;BlinkMac" w:hAnsi="apple-system;system-ui;BlinkMac"/>
           <w:color w:val="000000"/>
           <w:sz w:val="30"/>
-          <w:lang w:val="en-ZA"/>
         </w:rPr>
         <w:t>riminal history</w:t>
       </w:r>
@@ -712,34 +898,30 @@
           <w:rFonts w:ascii="apple-system;system-ui;BlinkMac" w:hAnsi="apple-system;system-ui;BlinkMac"/>
           <w:color w:val="000000"/>
           <w:sz w:val="30"/>
-          <w:lang w:val="en-ZA"/>
-        </w:rPr>
-        <w:t xml:space="preserve">. But has </w:t>
-      </w:r>
-      <w:r>
-        <w:rPr>
-          <w:rFonts w:ascii="apple-system;system-ui;BlinkMac" w:hAnsi="apple-system;system-ui;BlinkMac"/>
-          <w:color w:val="000000"/>
-          <w:sz w:val="30"/>
-          <w:lang w:val="en-ZA"/>
-        </w:rPr>
-        <w:t>he just</w:t>
-      </w:r>
-      <w:r>
-        <w:rPr>
-          <w:rFonts w:ascii="apple-system;system-ui;BlinkMac" w:hAnsi="apple-system;system-ui;BlinkMac"/>
-          <w:color w:val="000000"/>
-          <w:sz w:val="30"/>
-          <w:lang w:val="en-ZA"/>
-        </w:rPr>
-        <w:t xml:space="preserve"> stumbled on the loot </w:t>
-      </w:r>
-      <w:r>
-        <w:rPr>
-          <w:rFonts w:ascii="apple-system;system-ui;BlinkMac" w:hAnsi="apple-system;system-ui;BlinkMac"/>
-          <w:color w:val="000000"/>
-          <w:sz w:val="30"/>
-          <w:lang w:val="en-ZA"/>
+        </w:rPr>
+        <w:t>. But</w:t>
+      </w:r>
+      <w:r>
+        <w:rPr>
+          <w:rFonts w:ascii="apple-system;system-ui;BlinkMac" w:hAnsi="apple-system;system-ui;BlinkMac"/>
+          <w:color w:val="000000"/>
+          <w:sz w:val="30"/>
+        </w:rPr>
+        <w:t xml:space="preserve"> did he just</w:t>
+      </w:r>
+      <w:r>
+        <w:rPr>
+          <w:rFonts w:ascii="apple-system;system-ui;BlinkMac" w:hAnsi="apple-system;system-ui;BlinkMac"/>
+          <w:color w:val="000000"/>
+          <w:sz w:val="30"/>
+        </w:rPr>
+        <w:t xml:space="preserve"> stumble on the loot </w:t>
+      </w:r>
+      <w:r>
+        <w:rPr>
+          <w:rFonts w:ascii="apple-system;system-ui;BlinkMac" w:hAnsi="apple-system;system-ui;BlinkMac"/>
+          <w:color w:val="000000"/>
+          <w:sz w:val="30"/>
         </w:rPr>
         <w:t>from</w:t>
       </w:r>
@@ -748,7 +930,6 @@
           <w:rFonts w:ascii="apple-system;system-ui;BlinkMac" w:hAnsi="apple-system;system-ui;BlinkMac"/>
           <w:color w:val="000000"/>
           <w:sz w:val="30"/>
-          <w:lang w:val="en-ZA"/>
         </w:rPr>
         <w:t xml:space="preserve"> the most</w:t>
       </w:r>
@@ -757,7 +938,6 @@
           <w:rFonts w:ascii="apple-system;system-ui;BlinkMac" w:hAnsi="apple-system;system-ui;BlinkMac"/>
           <w:color w:val="000000"/>
           <w:sz w:val="30"/>
-          <w:lang w:val="en-ZA"/>
         </w:rPr>
         <w:t xml:space="preserve"> </w:t>
       </w:r>
@@ -766,16 +946,32 @@
           <w:rFonts w:ascii="apple-system;system-ui;BlinkMac" w:hAnsi="apple-system;system-ui;BlinkMac"/>
           <w:color w:val="000000"/>
           <w:sz w:val="30"/>
-          <w:lang w:val="en-ZA"/>
-        </w:rPr>
-        <w:t>famous armed robbery in British criminal history</w:t>
-      </w:r>
-      <w:r>
-        <w:rPr>
-          <w:rFonts w:ascii="apple-system;system-ui;BlinkMac" w:hAnsi="apple-system;system-ui;BlinkMac"/>
-          <w:color w:val="000000"/>
-          <w:sz w:val="30"/>
-          <w:lang w:val="en-ZA"/>
+        </w:rPr>
+        <w:t xml:space="preserve">famous </w:t>
+      </w:r>
+      <w:r>
+        <w:rPr>
+          <w:rFonts w:ascii="apple-system;system-ui;BlinkMac" w:hAnsi="apple-system;system-ui;BlinkMac"/>
+          <w:i/>
+          <w:iCs/>
+          <w:color w:val="000000"/>
+          <w:sz w:val="30"/>
+        </w:rPr>
+        <w:t>armed robbery</w:t>
+      </w:r>
+      <w:r>
+        <w:rPr>
+          <w:rFonts w:ascii="apple-system;system-ui;BlinkMac" w:hAnsi="apple-system;system-ui;BlinkMac"/>
+          <w:color w:val="000000"/>
+          <w:sz w:val="30"/>
+        </w:rPr>
+        <w:t xml:space="preserve"> in British criminal history</w:t>
+      </w:r>
+      <w:r>
+        <w:rPr>
+          <w:rFonts w:ascii="apple-system;system-ui;BlinkMac" w:hAnsi="apple-system;system-ui;BlinkMac"/>
+          <w:color w:val="000000"/>
+          <w:sz w:val="30"/>
         </w:rPr>
         <w:t>?</w:t>
       </w:r>
@@ -784,7 +980,6 @@
           <w:rFonts w:ascii="apple-system;system-ui;BlinkMac" w:hAnsi="apple-system;system-ui;BlinkMac"/>
           <w:color w:val="000000"/>
           <w:sz w:val="30"/>
-          <w:lang w:val="en-ZA"/>
         </w:rPr>
         <w:t xml:space="preserve"> </w:t>
       </w:r>
@@ -793,7 +988,6 @@
           <w:rFonts w:ascii="apple-system;system-ui;BlinkMac" w:hAnsi="apple-system;system-ui;BlinkMac"/>
           <w:color w:val="000000"/>
           <w:sz w:val="30"/>
-          <w:lang w:val="en-ZA"/>
         </w:rPr>
         <w:t xml:space="preserve">Could </w:t>
       </w:r>
@@ -802,7 +996,6 @@
           <w:rFonts w:ascii="apple-system;system-ui;BlinkMac" w:hAnsi="apple-system;system-ui;BlinkMac"/>
           <w:color w:val="000000"/>
           <w:sz w:val="30"/>
-          <w:lang w:val="en-ZA"/>
         </w:rPr>
         <w:t xml:space="preserve">he </w:t>
       </w:r>
@@ -811,7 +1004,6 @@
           <w:rFonts w:ascii="apple-system;system-ui;BlinkMac" w:hAnsi="apple-system;system-ui;BlinkMac"/>
           <w:color w:val="000000"/>
           <w:sz w:val="30"/>
-          <w:lang w:val="en-ZA"/>
         </w:rPr>
         <w:t xml:space="preserve">use </w:t>
       </w:r>
@@ -820,7 +1012,6 @@
           <w:rFonts w:ascii="apple-system;system-ui;BlinkMac" w:hAnsi="apple-system;system-ui;BlinkMac"/>
           <w:color w:val="000000"/>
           <w:sz w:val="30"/>
-          <w:lang w:val="en-ZA"/>
         </w:rPr>
         <w:t xml:space="preserve">the </w:t>
       </w:r>
@@ -829,16 +1020,30 @@
           <w:rFonts w:ascii="apple-system;system-ui;BlinkMac" w:hAnsi="apple-system;system-ui;BlinkMac"/>
           <w:color w:val="000000"/>
           <w:sz w:val="30"/>
-          <w:lang w:val="en-ZA"/>
-        </w:rPr>
-        <w:t>one to get him out of the trouble he’s in with the other</w:t>
-      </w:r>
-      <w:r>
-        <w:rPr>
-          <w:rFonts w:ascii="apple-system;system-ui;BlinkMac" w:hAnsi="apple-system;system-ui;BlinkMac"/>
-          <w:color w:val="000000"/>
-          <w:sz w:val="30"/>
-          <w:lang w:val="en-ZA"/>
+        </w:rPr>
+        <w:t xml:space="preserve">one to get out of the trouble </w:t>
+      </w:r>
+      <w:r>
+        <w:rPr>
+          <w:rFonts w:ascii="apple-system;system-ui;BlinkMac" w:hAnsi="apple-system;system-ui;BlinkMac"/>
+          <w:color w:val="000000"/>
+          <w:sz w:val="30"/>
+        </w:rPr>
+        <w:t xml:space="preserve">for the </w:t>
+      </w:r>
+      <w:r>
+        <w:rPr>
+          <w:rFonts w:ascii="apple-system;system-ui;BlinkMac" w:hAnsi="apple-system;system-ui;BlinkMac"/>
+          <w:color w:val="000000"/>
+          <w:sz w:val="30"/>
+        </w:rPr>
+        <w:t>other</w:t>
+      </w:r>
+      <w:r>
+        <w:rPr>
+          <w:rFonts w:ascii="apple-system;system-ui;BlinkMac" w:hAnsi="apple-system;system-ui;BlinkMac"/>
+          <w:color w:val="000000"/>
+          <w:sz w:val="30"/>
         </w:rPr>
         <w:t>?</w:t>
       </w:r>
@@ -851,7 +1056,6 @@
           <w:rFonts w:ascii="apple-system;system-ui;BlinkMac" w:hAnsi="apple-system;system-ui;BlinkMac"/>
           <w:color w:val="000000"/>
           <w:sz w:val="30"/>
-          <w:lang w:val="en-ZA"/>
         </w:rPr>
       </w:pPr>
     </w:p>
@@ -863,7 +1067,6 @@
           <w:rFonts w:ascii="apple-system;system-ui;BlinkMac" w:hAnsi="apple-system;system-ui;BlinkMac"/>
           <w:color w:val="000000"/>
           <w:sz w:val="30"/>
-          <w:lang w:val="en-ZA"/>
         </w:rPr>
       </w:pPr>
       <w:r>
@@ -871,25 +1074,31 @@
           <w:rFonts w:ascii="apple-system;system-ui;BlinkMac" w:hAnsi="apple-system;system-ui;BlinkMac"/>
           <w:color w:val="000000"/>
           <w:sz w:val="30"/>
-          <w:lang w:val="en-ZA"/>
-        </w:rPr>
-        <w:t xml:space="preserve">Right now? No. Because </w:t>
-      </w:r>
-      <w:r>
-        <w:rPr>
-          <w:rFonts w:ascii="apple-system;system-ui;BlinkMac" w:hAnsi="apple-system;system-ui;BlinkMac"/>
-          <w:color w:val="000000"/>
-          <w:sz w:val="30"/>
-          <w:lang w:val="en-ZA"/>
-        </w:rPr>
-        <w:t>nothing is ever that straight forward</w:t>
-      </w:r>
-      <w:r>
-        <w:rPr>
-          <w:rFonts w:ascii="apple-system;system-ui;BlinkMac" w:hAnsi="apple-system;system-ui;BlinkMac"/>
-          <w:color w:val="000000"/>
-          <w:sz w:val="30"/>
-          <w:lang w:val="en-ZA"/>
+        </w:rPr>
+        <w:lastRenderedPageBreak/>
+        <w:t xml:space="preserve">Right now? No. </w:t>
+      </w:r>
+      <w:r>
+        <w:rPr>
+          <w:rFonts w:ascii="apple-system;system-ui;BlinkMac" w:hAnsi="apple-system;system-ui;BlinkMac"/>
+          <w:color w:val="000000"/>
+          <w:sz w:val="30"/>
+        </w:rPr>
+        <w:t>N</w:t>
+      </w:r>
+      <w:r>
+        <w:rPr>
+          <w:rFonts w:ascii="apple-system;system-ui;BlinkMac" w:hAnsi="apple-system;system-ui;BlinkMac"/>
+          <w:color w:val="000000"/>
+          <w:sz w:val="30"/>
+        </w:rPr>
+        <w:t>one</w:t>
+      </w:r>
+      <w:r>
+        <w:rPr>
+          <w:rFonts w:ascii="apple-system;system-ui;BlinkMac" w:hAnsi="apple-system;system-ui;BlinkMac"/>
+          <w:color w:val="000000"/>
+          <w:sz w:val="30"/>
         </w:rPr>
         <w:t>.</w:t>
       </w:r>
@@ -898,7 +1107,6 @@
           <w:rFonts w:ascii="apple-system;system-ui;BlinkMac" w:hAnsi="apple-system;system-ui;BlinkMac"/>
           <w:color w:val="000000"/>
           <w:sz w:val="30"/>
-          <w:lang w:val="en-ZA"/>
         </w:rPr>
         <w:t xml:space="preserve"> </w:t>
       </w:r>
@@ -907,25 +1115,22 @@
           <w:rFonts w:ascii="apple-system;system-ui;BlinkMac" w:hAnsi="apple-system;system-ui;BlinkMac"/>
           <w:color w:val="000000"/>
           <w:sz w:val="30"/>
-          <w:lang w:val="en-ZA"/>
-        </w:rPr>
-        <w:t>A</w:t>
-      </w:r>
-      <w:r>
-        <w:rPr>
-          <w:rFonts w:ascii="apple-system;system-ui;BlinkMac" w:hAnsi="apple-system;system-ui;BlinkMac"/>
-          <w:color w:val="000000"/>
-          <w:sz w:val="30"/>
-          <w:lang w:val="en-ZA"/>
-        </w:rPr>
-        <w:t xml:space="preserve">nd none of his troubles are going anywhere unless he can </w:t>
-      </w:r>
-      <w:r>
-        <w:rPr>
-          <w:rFonts w:ascii="apple-system;system-ui;BlinkMac" w:hAnsi="apple-system;system-ui;BlinkMac"/>
-          <w:color w:val="000000"/>
-          <w:sz w:val="30"/>
-          <w:lang w:val="en-ZA"/>
+        </w:rPr>
+        <w:t xml:space="preserve">Because none </w:t>
+      </w:r>
+      <w:r>
+        <w:rPr>
+          <w:rFonts w:ascii="apple-system;system-ui;BlinkMac" w:hAnsi="apple-system;system-ui;BlinkMac"/>
+          <w:color w:val="000000"/>
+          <w:sz w:val="30"/>
+        </w:rPr>
+        <w:t xml:space="preserve">of his troubles are going anywhere unless he can </w:t>
+      </w:r>
+      <w:r>
+        <w:rPr>
+          <w:rFonts w:ascii="apple-system;system-ui;BlinkMac" w:hAnsi="apple-system;system-ui;BlinkMac"/>
+          <w:color w:val="000000"/>
+          <w:sz w:val="30"/>
         </w:rPr>
         <w:t>explain the</w:t>
       </w:r>
@@ -934,7 +1139,6 @@
           <w:rFonts w:ascii="apple-system;system-ui;BlinkMac" w:hAnsi="apple-system;system-ui;BlinkMac"/>
           <w:color w:val="000000"/>
           <w:sz w:val="30"/>
-          <w:lang w:val="en-ZA"/>
         </w:rPr>
         <w:t xml:space="preserve"> </w:t>
       </w:r>
@@ -943,7 +1147,6 @@
           <w:rFonts w:ascii="apple-system;system-ui;BlinkMac" w:hAnsi="apple-system;system-ui;BlinkMac"/>
           <w:color w:val="000000"/>
           <w:sz w:val="30"/>
-          <w:lang w:val="en-ZA"/>
         </w:rPr>
         <w:t>corpse</w:t>
       </w:r>
@@ -952,61 +1155,54 @@
           <w:rFonts w:ascii="apple-system;system-ui;BlinkMac" w:hAnsi="apple-system;system-ui;BlinkMac"/>
           <w:color w:val="000000"/>
           <w:sz w:val="30"/>
-          <w:lang w:val="en-ZA"/>
-        </w:rPr>
-        <w:t xml:space="preserve"> he</w:t>
-      </w:r>
-      <w:r>
-        <w:rPr>
-          <w:rFonts w:ascii="apple-system;system-ui;BlinkMac" w:hAnsi="apple-system;system-ui;BlinkMac"/>
-          <w:color w:val="000000"/>
-          <w:sz w:val="30"/>
-          <w:lang w:val="en-ZA"/>
-        </w:rPr>
-        <w:t xml:space="preserve"> just</w:t>
-      </w:r>
-      <w:r>
-        <w:rPr>
-          <w:rFonts w:ascii="apple-system;system-ui;BlinkMac" w:hAnsi="apple-system;system-ui;BlinkMac"/>
-          <w:color w:val="000000"/>
-          <w:sz w:val="30"/>
-          <w:lang w:val="en-ZA"/>
-        </w:rPr>
-        <w:t xml:space="preserve"> found while looking for somewhere to </w:t>
-      </w:r>
-      <w:r>
-        <w:rPr>
-          <w:rFonts w:ascii="apple-system;system-ui;BlinkMac" w:hAnsi="apple-system;system-ui;BlinkMac"/>
-          <w:color w:val="000000"/>
-          <w:sz w:val="30"/>
-          <w:lang w:val="en-ZA"/>
-        </w:rPr>
-        <w:t>keep</w:t>
-      </w:r>
-      <w:r>
-        <w:rPr>
-          <w:rFonts w:ascii="apple-system;system-ui;BlinkMac" w:hAnsi="apple-system;system-ui;BlinkMac"/>
-          <w:color w:val="000000"/>
-          <w:sz w:val="30"/>
-          <w:lang w:val="en-ZA"/>
-        </w:rPr>
-        <w:t xml:space="preserve"> his</w:t>
-      </w:r>
-      <w:r>
-        <w:rPr>
-          <w:rFonts w:ascii="apple-system;system-ui;BlinkMac" w:hAnsi="apple-system;system-ui;BlinkMac"/>
-          <w:color w:val="000000"/>
-          <w:sz w:val="30"/>
-          <w:lang w:val="en-ZA"/>
-        </w:rPr>
-        <w:t xml:space="preserve"> microwave pizzas</w:t>
-      </w:r>
-      <w:r>
-        <w:rPr>
-          <w:rFonts w:ascii="apple-system;system-ui;BlinkMac" w:hAnsi="apple-system;system-ui;BlinkMac"/>
-          <w:color w:val="000000"/>
-          <w:sz w:val="30"/>
-          <w:lang w:val="en-ZA"/>
+        </w:rPr>
+        <w:t xml:space="preserve"> in the freezer</w:t>
+      </w:r>
+      <w:r>
+        <w:rPr>
+          <w:rFonts w:ascii="apple-system;system-ui;BlinkMac" w:hAnsi="apple-system;system-ui;BlinkMac"/>
+          <w:color w:val="000000"/>
+          <w:sz w:val="30"/>
+        </w:rPr>
+        <w:t>. The one he just found</w:t>
+      </w:r>
+      <w:r>
+        <w:rPr>
+          <w:rFonts w:ascii="apple-system;system-ui;BlinkMac" w:hAnsi="apple-system;system-ui;BlinkMac"/>
+          <w:color w:val="000000"/>
+          <w:sz w:val="30"/>
+        </w:rPr>
+        <w:t xml:space="preserve"> </w:t>
+      </w:r>
+      <w:r>
+        <w:rPr>
+          <w:rFonts w:ascii="apple-system;system-ui;BlinkMac" w:hAnsi="apple-system;system-ui;BlinkMac"/>
+          <w:color w:val="000000"/>
+          <w:sz w:val="30"/>
+        </w:rPr>
+        <w:t>while looking for somewhere</w:t>
+      </w:r>
+      <w:r>
+        <w:rPr>
+          <w:rFonts w:ascii="apple-system;system-ui;BlinkMac" w:hAnsi="apple-system;system-ui;BlinkMac"/>
+          <w:color w:val="000000"/>
+          <w:sz w:val="30"/>
+        </w:rPr>
+        <w:t xml:space="preserve"> to put his</w:t>
+      </w:r>
+      <w:r>
+        <w:rPr>
+          <w:rFonts w:ascii="apple-system;system-ui;BlinkMac" w:hAnsi="apple-system;system-ui;BlinkMac"/>
+          <w:color w:val="000000"/>
+          <w:sz w:val="30"/>
+        </w:rPr>
+        <w:t xml:space="preserve"> fishfingers and frozen peas</w:t>
+      </w:r>
+      <w:r>
+        <w:rPr>
+          <w:rFonts w:ascii="apple-system;system-ui;BlinkMac" w:hAnsi="apple-system;system-ui;BlinkMac"/>
+          <w:color w:val="000000"/>
+          <w:sz w:val="30"/>
         </w:rPr>
         <w:t xml:space="preserve">.  </w:t>
       </w:r>
@@ -1019,7 +1215,6 @@
           <w:rFonts w:ascii="apple-system;system-ui;BlinkMac" w:hAnsi="apple-system;system-ui;BlinkMac"/>
           <w:color w:val="000000"/>
           <w:sz w:val="30"/>
-          <w:lang w:val="en-ZA"/>
         </w:rPr>
       </w:pPr>
     </w:p>
@@ -1031,7 +1226,6 @@
           <w:rFonts w:ascii="apple-system;system-ui;BlinkMac" w:hAnsi="apple-system;system-ui;BlinkMac"/>
           <w:color w:val="000000"/>
           <w:sz w:val="30"/>
-          <w:lang w:val="en-ZA"/>
         </w:rPr>
       </w:pPr>
     </w:p>
@@ -1448,6 +1642,9 @@
     <w:pPr>
       <w:overflowPunct w:val="0"/>
     </w:pPr>
+    <w:rPr>
+      <w:lang w:val="en-ZA"/>
+    </w:rPr>
   </w:style>
   <w:style w:type="character" w:default="1" w:styleId="DefaultParagraphFont">
     <w:name w:val="Default Paragraph Font"/>

</xml_diff>